<commit_message>
feat(deploy): self-load the database on first boot (free tier has no Shell)
- server/bootstrap.js: on startup, if the menu_item table is missing, run
  schema.sql + seed.sql + menu_images.sql against the connected database. It
  is a no-op once the schema exists, so redeploys never touch data.
- db/setup.mjs: enable SSL for any non-local host so it works against Render's
  external connection string.
- README / application document: drop the Render Shell step; note the app
  self-loads and how to reset the hosted data from a laptop.

Co-Authored-By: Claude Sonnet 5 <noreply@anthropic.com>
</commit_message>
<xml_diff>
--- a/docs/Chowly - Application Document.docx
+++ b/docs/Chowly - Application Document.docx
@@ -472,7 +472,7 @@
         <w:t xml:space="preserve">server/ </w:t>
       </w:r>
       <w:r>
-        <w:t xml:space="preserve">— the Express JSON API: db.js (one connection pool), config.js, middleware.js (role guards), and routes for session, menu, and orders.</w:t>
+        <w:t xml:space="preserve">— the Express JSON API: db.js (one connection pool), bootstrap.js (first-boot schema load), config.js, middleware.js (role guards), and routes for session, menu, and orders.</w:t>
       </w:r>
     </w:p>
     <w:p>
@@ -1330,7 +1330,7 @@
                 <w:sz w:val="20"/>
                 <w:szCs w:val="20"/>
               </w:rPr>
-              <w:t xml:space="preserve">GET /api/me</w:t>
+              <w:t xml:space="preserve">GET /api/health</w:t>
             </w:r>
           </w:p>
         </w:tc>
@@ -1380,7 +1380,7 @@
                 <w:sz w:val="20"/>
                 <w:szCs w:val="20"/>
               </w:rPr>
-              <w:t xml:space="preserve">Active role, customer identity, current order, venue.</w:t>
+              <w:t xml:space="preserve">Liveness check (no database) — the Render health check.</w:t>
             </w:r>
           </w:p>
         </w:tc>
@@ -1410,7 +1410,7 @@
                 <w:sz w:val="20"/>
                 <w:szCs w:val="20"/>
               </w:rPr>
-              <w:t xml:space="preserve">POST /api/session/customer</w:t>
+              <w:t xml:space="preserve">GET /api/health/db</w:t>
             </w:r>
           </w:p>
         </w:tc>
@@ -1460,7 +1460,7 @@
                 <w:sz w:val="20"/>
                 <w:szCs w:val="20"/>
               </w:rPr>
-              <w:t xml:space="preserve">Create the customer row and become a customer.</w:t>
+              <w:t xml:space="preserve">Database round-trip check (SELECT now()).</w:t>
             </w:r>
           </w:p>
         </w:tc>
@@ -1490,7 +1490,7 @@
                 <w:sz w:val="20"/>
                 <w:szCs w:val="20"/>
               </w:rPr>
-              <w:t xml:space="preserve">POST /api/session/role</w:t>
+              <w:t xml:space="preserve">GET /api/me</w:t>
             </w:r>
           </w:p>
         </w:tc>
@@ -1540,7 +1540,7 @@
                 <w:sz w:val="20"/>
                 <w:szCs w:val="20"/>
               </w:rPr>
-              <w:t xml:space="preserve">Flip the Customer / Waiter view (keeps identity).</w:t>
+              <w:t xml:space="preserve">Active role, customer identity, current order, venue.</w:t>
             </w:r>
           </w:p>
         </w:tc>
@@ -1570,7 +1570,7 @@
                 <w:sz w:val="20"/>
                 <w:szCs w:val="20"/>
               </w:rPr>
-              <w:t xml:space="preserve">POST /api/session/switch</w:t>
+              <w:t xml:space="preserve">POST /api/session/customer</w:t>
             </w:r>
           </w:p>
         </w:tc>
@@ -1620,7 +1620,7 @@
                 <w:sz w:val="20"/>
                 <w:szCs w:val="20"/>
               </w:rPr>
-              <w:t xml:space="preserve">Full reset — forget identity and current order.</w:t>
+              <w:t xml:space="preserve">Create the customer row and become a customer.</w:t>
             </w:r>
           </w:p>
         </w:tc>
@@ -1650,7 +1650,7 @@
                 <w:sz w:val="20"/>
                 <w:szCs w:val="20"/>
               </w:rPr>
-              <w:t xml:space="preserve">GET /api/menu</w:t>
+              <w:t xml:space="preserve">POST /api/session/role</w:t>
             </w:r>
           </w:p>
         </w:tc>
@@ -1700,7 +1700,7 @@
                 <w:sz w:val="20"/>
                 <w:szCs w:val="20"/>
               </w:rPr>
-              <w:t xml:space="preserve">Available items for the venue, including image_url.</w:t>
+              <w:t xml:space="preserve">Flip the Customer / Waiter view (keeps identity).</w:t>
             </w:r>
           </w:p>
         </w:tc>
@@ -1730,7 +1730,7 @@
                 <w:sz w:val="20"/>
                 <w:szCs w:val="20"/>
               </w:rPr>
-              <w:t xml:space="preserve">GET /api/staff</w:t>
+              <w:t xml:space="preserve">POST /api/session/switch</w:t>
             </w:r>
           </w:p>
         </w:tc>
@@ -1755,7 +1755,7 @@
                 <w:sz w:val="20"/>
                 <w:szCs w:val="20"/>
               </w:rPr>
-              <w:t xml:space="preserve">waiter</w:t>
+              <w:t xml:space="preserve">any</w:t>
             </w:r>
           </w:p>
         </w:tc>
@@ -1780,7 +1780,7 @@
                 <w:sz w:val="20"/>
                 <w:szCs w:val="20"/>
               </w:rPr>
-              <w:t xml:space="preserve">Waiter / chef / bartender lists for the dropdowns.</w:t>
+              <w:t xml:space="preserve">Full reset — forget identity and current order.</w:t>
             </w:r>
           </w:p>
         </w:tc>
@@ -1810,7 +1810,7 @@
                 <w:sz w:val="20"/>
                 <w:szCs w:val="20"/>
               </w:rPr>
-              <w:t xml:space="preserve">POST /api/orders</w:t>
+              <w:t xml:space="preserve">GET /api/menu</w:t>
             </w:r>
           </w:p>
         </w:tc>
@@ -1835,7 +1835,7 @@
                 <w:sz w:val="20"/>
                 <w:szCs w:val="20"/>
               </w:rPr>
-              <w:t xml:space="preserve">customer</w:t>
+              <w:t xml:space="preserve">any</w:t>
             </w:r>
           </w:p>
         </w:tc>
@@ -1860,7 +1860,7 @@
                 <w:sz w:val="20"/>
                 <w:szCs w:val="20"/>
               </w:rPr>
-              <w:t xml:space="preserve">Place an order (one transaction; price snapshot; wait estimate).</w:t>
+              <w:t xml:space="preserve">Available items for the venue, including image_url.</w:t>
             </w:r>
           </w:p>
         </w:tc>
@@ -1890,7 +1890,7 @@
                 <w:sz w:val="20"/>
                 <w:szCs w:val="20"/>
               </w:rPr>
-              <w:t xml:space="preserve">POST /api/orders/lookup</w:t>
+              <w:t xml:space="preserve">GET /api/staff</w:t>
             </w:r>
           </w:p>
         </w:tc>
@@ -1915,7 +1915,7 @@
                 <w:sz w:val="20"/>
                 <w:szCs w:val="20"/>
               </w:rPr>
-              <w:t xml:space="preserve">any</w:t>
+              <w:t xml:space="preserve">waiter</w:t>
             </w:r>
           </w:p>
         </w:tc>
@@ -1940,7 +1940,7 @@
                 <w:sz w:val="20"/>
                 <w:szCs w:val="20"/>
               </w:rPr>
-              <w:t xml:space="preserve">Find an order by name + table and resume the session on it.</w:t>
+              <w:t xml:space="preserve">Waiter / chef / bartender lists for the dropdowns.</w:t>
             </w:r>
           </w:p>
         </w:tc>
@@ -1970,7 +1970,7 @@
                 <w:sz w:val="20"/>
                 <w:szCs w:val="20"/>
               </w:rPr>
-              <w:t xml:space="preserve">GET /api/orders/:id</w:t>
+              <w:t xml:space="preserve">POST /api/orders</w:t>
             </w:r>
           </w:p>
         </w:tc>
@@ -1995,7 +1995,7 @@
                 <w:sz w:val="20"/>
                 <w:szCs w:val="20"/>
               </w:rPr>
-              <w:t xml:space="preserve">any</w:t>
+              <w:t xml:space="preserve">customer</w:t>
             </w:r>
           </w:p>
         </w:tc>
@@ -2020,7 +2020,7 @@
                 <w:sz w:val="20"/>
                 <w:szCs w:val="20"/>
               </w:rPr>
-              <w:t xml:space="preserve">Full order detail: items, staff, payment, complaint, rating.</w:t>
+              <w:t xml:space="preserve">Place an order (one transaction; price snapshot; wait estimate).</w:t>
             </w:r>
           </w:p>
         </w:tc>
@@ -2050,7 +2050,7 @@
                 <w:sz w:val="20"/>
                 <w:szCs w:val="20"/>
               </w:rPr>
-              <w:t xml:space="preserve">GET /api/waiter/orders</w:t>
+              <w:t xml:space="preserve">POST /api/orders/lookup</w:t>
             </w:r>
           </w:p>
         </w:tc>
@@ -2075,7 +2075,7 @@
                 <w:sz w:val="20"/>
                 <w:szCs w:val="20"/>
               </w:rPr>
-              <w:t xml:space="preserve">waiter</w:t>
+              <w:t xml:space="preserve">any</w:t>
             </w:r>
           </w:p>
         </w:tc>
@@ -2100,7 +2100,7 @@
                 <w:sz w:val="20"/>
                 <w:szCs w:val="20"/>
               </w:rPr>
-              <w:t xml:space="preserve">The board: every order with items, total, payment method, open complaint.</w:t>
+              <w:t xml:space="preserve">Find an order by name + table and resume the session on it.</w:t>
             </w:r>
           </w:p>
         </w:tc>
@@ -2130,7 +2130,7 @@
                 <w:sz w:val="20"/>
                 <w:szCs w:val="20"/>
               </w:rPr>
-              <w:t xml:space="preserve">POST /api/orders/:id/assign</w:t>
+              <w:t xml:space="preserve">GET /api/orders/:id</w:t>
             </w:r>
           </w:p>
         </w:tc>
@@ -2155,7 +2155,7 @@
                 <w:sz w:val="20"/>
                 <w:szCs w:val="20"/>
               </w:rPr>
-              <w:t xml:space="preserve">waiter</w:t>
+              <w:t xml:space="preserve">any</w:t>
             </w:r>
           </w:p>
         </w:tc>
@@ -2180,7 +2180,7 @@
                 <w:sz w:val="20"/>
                 <w:szCs w:val="20"/>
               </w:rPr>
-              <w:t xml:space="preserve">Record waiter / chef / bartender, move to preparing, stamp prep start.</w:t>
+              <w:t xml:space="preserve">Full order detail: items, staff, payment, complaint, rating.</w:t>
             </w:r>
           </w:p>
         </w:tc>
@@ -2210,7 +2210,7 @@
                 <w:sz w:val="20"/>
                 <w:szCs w:val="20"/>
               </w:rPr>
-              <w:t xml:space="preserve">POST /api/orders/:id/serve</w:t>
+              <w:t xml:space="preserve">GET /api/waiter/orders</w:t>
             </w:r>
           </w:p>
         </w:tc>
@@ -2260,7 +2260,7 @@
                 <w:sz w:val="20"/>
                 <w:szCs w:val="20"/>
               </w:rPr>
-              <w:t xml:space="preserve">Move to served; stamp served_at, actual_wait_minutes, prep end.</w:t>
+              <w:t xml:space="preserve">The board: every order with items, total, payment method, open complaint.</w:t>
             </w:r>
           </w:p>
         </w:tc>
@@ -2290,7 +2290,7 @@
                 <w:sz w:val="20"/>
                 <w:szCs w:val="20"/>
               </w:rPr>
-              <w:t xml:space="preserve">POST /api/orders/:id/complaint</w:t>
+              <w:t xml:space="preserve">POST /api/orders/:id/assign</w:t>
             </w:r>
           </w:p>
         </w:tc>
@@ -2315,7 +2315,7 @@
                 <w:sz w:val="20"/>
                 <w:szCs w:val="20"/>
               </w:rPr>
-              <w:t xml:space="preserve">customer</w:t>
+              <w:t xml:space="preserve">waiter</w:t>
             </w:r>
           </w:p>
         </w:tc>
@@ -2340,7 +2340,7 @@
                 <w:sz w:val="20"/>
                 <w:szCs w:val="20"/>
               </w:rPr>
-              <w:t xml:space="preserve">File a complaint against the order.</w:t>
+              <w:t xml:space="preserve">Record waiter / chef / bartender, move to preparing, stamp prep start.</w:t>
             </w:r>
           </w:p>
         </w:tc>
@@ -2370,7 +2370,7 @@
                 <w:sz w:val="20"/>
                 <w:szCs w:val="20"/>
               </w:rPr>
-              <w:t xml:space="preserve">POST /api/orders/:id/rating</w:t>
+              <w:t xml:space="preserve">POST /api/orders/:id/serve</w:t>
             </w:r>
           </w:p>
         </w:tc>
@@ -2395,7 +2395,7 @@
                 <w:sz w:val="20"/>
                 <w:szCs w:val="20"/>
               </w:rPr>
-              <w:t xml:space="preserve">customer</w:t>
+              <w:t xml:space="preserve">waiter</w:t>
             </w:r>
           </w:p>
         </w:tc>
@@ -2420,7 +2420,7 @@
                 <w:sz w:val="20"/>
                 <w:szCs w:val="20"/>
               </w:rPr>
-              <w:t xml:space="preserve">1–5 rating with an optional comment (upsert on order_id).</w:t>
+              <w:t xml:space="preserve">Move to served; stamp served_at, actual_wait_minutes, prep end.</w:t>
             </w:r>
           </w:p>
         </w:tc>
@@ -2450,7 +2450,7 @@
                 <w:sz w:val="20"/>
                 <w:szCs w:val="20"/>
               </w:rPr>
-              <w:t xml:space="preserve">POST /api/orders/:id/pay</w:t>
+              <w:t xml:space="preserve">POST /api/orders/:id/complaint</w:t>
             </w:r>
           </w:p>
         </w:tc>
@@ -2475,7 +2475,7 @@
                 <w:sz w:val="20"/>
                 <w:szCs w:val="20"/>
               </w:rPr>
-              <w:t xml:space="preserve">waiter</w:t>
+              <w:t xml:space="preserve">customer</w:t>
             </w:r>
           </w:p>
         </w:tc>
@@ -2500,7 +2500,7 @@
                 <w:sz w:val="20"/>
                 <w:szCs w:val="20"/>
               </w:rPr>
-              <w:t xml:space="preserve">Record a pretend payment (cash / card / transfer); move to paid.</w:t>
+              <w:t xml:space="preserve">File a complaint against the order.</w:t>
             </w:r>
           </w:p>
         </w:tc>
@@ -2530,6 +2530,166 @@
                 <w:sz w:val="20"/>
                 <w:szCs w:val="20"/>
               </w:rPr>
+              <w:t xml:space="preserve">POST /api/orders/:id/rating</w:t>
+            </w:r>
+          </w:p>
+        </w:tc>
+        <w:tc>
+          <w:tcPr>
+            <w:tcW w:type="dxa" w:w="1500"/>
+            <w:tcMar>
+              <w:top w:type="dxa" w:w="60"/>
+              <w:left w:type="dxa" w:w="100"/>
+              <w:bottom w:type="dxa" w:w="60"/>
+              <w:right w:type="dxa" w:w="100"/>
+            </w:tcMar>
+          </w:tcPr>
+          <w:p>
+            <w:pPr>
+              <w:spacing w:after="0" w:line="260"/>
+            </w:pPr>
+            <w:r>
+              <w:rPr>
+                <w:b w:val="false"/>
+                <w:bCs w:val="false"/>
+                <w:sz w:val="20"/>
+                <w:szCs w:val="20"/>
+              </w:rPr>
+              <w:t xml:space="preserve">customer</w:t>
+            </w:r>
+          </w:p>
+        </w:tc>
+        <w:tc>
+          <w:tcPr>
+            <w:tcW w:type="dxa" w:w="8150"/>
+            <w:tcMar>
+              <w:top w:type="dxa" w:w="60"/>
+              <w:left w:type="dxa" w:w="100"/>
+              <w:bottom w:type="dxa" w:w="60"/>
+              <w:right w:type="dxa" w:w="100"/>
+            </w:tcMar>
+          </w:tcPr>
+          <w:p>
+            <w:pPr>
+              <w:spacing w:after="0" w:line="260"/>
+            </w:pPr>
+            <w:r>
+              <w:rPr>
+                <w:b w:val="false"/>
+                <w:bCs w:val="false"/>
+                <w:sz w:val="20"/>
+                <w:szCs w:val="20"/>
+              </w:rPr>
+              <w:t xml:space="preserve">1–5 rating with an optional comment (upsert on order_id).</w:t>
+            </w:r>
+          </w:p>
+        </w:tc>
+      </w:tr>
+      <w:tr>
+        <w:trPr>
+          <w:tblHeader w:val="false"/>
+        </w:trPr>
+        <w:tc>
+          <w:tcPr>
+            <w:tcW w:type="dxa" w:w="4300"/>
+            <w:tcMar>
+              <w:top w:type="dxa" w:w="60"/>
+              <w:left w:type="dxa" w:w="100"/>
+              <w:bottom w:type="dxa" w:w="60"/>
+              <w:right w:type="dxa" w:w="100"/>
+            </w:tcMar>
+          </w:tcPr>
+          <w:p>
+            <w:pPr>
+              <w:spacing w:after="0" w:line="260"/>
+            </w:pPr>
+            <w:r>
+              <w:rPr>
+                <w:b w:val="false"/>
+                <w:bCs w:val="false"/>
+                <w:sz w:val="20"/>
+                <w:szCs w:val="20"/>
+              </w:rPr>
+              <w:t xml:space="preserve">POST /api/orders/:id/pay</w:t>
+            </w:r>
+          </w:p>
+        </w:tc>
+        <w:tc>
+          <w:tcPr>
+            <w:tcW w:type="dxa" w:w="1500"/>
+            <w:tcMar>
+              <w:top w:type="dxa" w:w="60"/>
+              <w:left w:type="dxa" w:w="100"/>
+              <w:bottom w:type="dxa" w:w="60"/>
+              <w:right w:type="dxa" w:w="100"/>
+            </w:tcMar>
+          </w:tcPr>
+          <w:p>
+            <w:pPr>
+              <w:spacing w:after="0" w:line="260"/>
+            </w:pPr>
+            <w:r>
+              <w:rPr>
+                <w:b w:val="false"/>
+                <w:bCs w:val="false"/>
+                <w:sz w:val="20"/>
+                <w:szCs w:val="20"/>
+              </w:rPr>
+              <w:t xml:space="preserve">waiter</w:t>
+            </w:r>
+          </w:p>
+        </w:tc>
+        <w:tc>
+          <w:tcPr>
+            <w:tcW w:type="dxa" w:w="8150"/>
+            <w:tcMar>
+              <w:top w:type="dxa" w:w="60"/>
+              <w:left w:type="dxa" w:w="100"/>
+              <w:bottom w:type="dxa" w:w="60"/>
+              <w:right w:type="dxa" w:w="100"/>
+            </w:tcMar>
+          </w:tcPr>
+          <w:p>
+            <w:pPr>
+              <w:spacing w:after="0" w:line="260"/>
+            </w:pPr>
+            <w:r>
+              <w:rPr>
+                <w:b w:val="false"/>
+                <w:bCs w:val="false"/>
+                <w:sz w:val="20"/>
+                <w:szCs w:val="20"/>
+              </w:rPr>
+              <w:t xml:space="preserve">Record a pretend payment (cash / card / transfer); move to paid.</w:t>
+            </w:r>
+          </w:p>
+        </w:tc>
+      </w:tr>
+      <w:tr>
+        <w:trPr>
+          <w:tblHeader w:val="false"/>
+        </w:trPr>
+        <w:tc>
+          <w:tcPr>
+            <w:tcW w:type="dxa" w:w="4300"/>
+            <w:tcMar>
+              <w:top w:type="dxa" w:w="60"/>
+              <w:left w:type="dxa" w:w="100"/>
+              <w:bottom w:type="dxa" w:w="60"/>
+              <w:right w:type="dxa" w:w="100"/>
+            </w:tcMar>
+          </w:tcPr>
+          <w:p>
+            <w:pPr>
+              <w:spacing w:after="0" w:line="260"/>
+            </w:pPr>
+            <w:r>
+              <w:rPr>
+                <w:b w:val="false"/>
+                <w:bCs w:val="false"/>
+                <w:sz w:val="20"/>
+                <w:szCs w:val="20"/>
+              </w:rPr>
               <w:t xml:space="preserve">POST /api/complaints/:id/resolve</w:t>
             </w:r>
           </w:p>
@@ -2599,7 +2759,15 @@
         <w:spacing w:after="160" w:line="278"/>
       </w:pPr>
       <w:r>
-        <w:t xml:space="preserve">render.yaml is a Render blueprint that creates a free Postgres instance (chowly-db) and a free Node web service (chowly). The build command installs both workspaces and builds client/dist; the start command runs the server. DATABASE_URL is injected from the database, SESSION_SECRET is generated by Render, and NODE_ENV is set to production. The server sets "trust proxy" and a secure session cookie for HTTPS behind Render’s proxy, and the database layer turns on SSL in production.</w:t>
+        <w:t xml:space="preserve">render.yaml is a Render blueprint that creates a free Postgres instance (chowly-db) and a free Node web service (chowly), both in the same region. DATABASE_URL is injected from the database, SESSION_SECRET is generated by Render, and NODE_ENV is set to production. The build command runs "npm install --omit=dev" for the root and server and "npm install --include=dev" for the client before "vite build"; the --include=dev is necessary because Render sets NODE_ENV=production during the build, which would otherwise skip Vite and Tailwind. The health check is a plain liveness check that does not touch the database, so a slow first-boot database cannot fail the deploy. The server sets "trust proxy" and a secure session cookie for HTTPS behind Render’s proxy, and the database layer turns on SSL in production.</w:t>
+      </w:r>
+    </w:p>
+    <w:p>
+      <w:pPr>
+        <w:spacing w:after="160" w:line="278"/>
+      </w:pPr>
+      <w:r>
+        <w:t xml:space="preserve">The free tier has no Shell, so server/bootstrap.js loads schema.sql, seed.sql and menu_images.sql automatically the first time the server starts against an empty database. It checks for the menu_item table and is a no-op once it exists, so redeploys never touch data.</w:t>
       </w:r>
     </w:p>
     <w:p>
@@ -2646,20 +2814,15 @@
         <w:spacing w:after="60" w:line="278"/>
       </w:pPr>
       <w:r>
-        <w:t xml:space="preserve">Open the chowly service → Shell and run node db/setup.mjs once. This applies schema.sql, seed.sql and menu_images.sql (it uses the pg driver, so no psql binary is needed on the host).</w:t>
-      </w:r>
-    </w:p>
-    <w:p>
-      <w:pPr>
-        <w:pStyle w:val="ListParagraph"/>
-        <w:numPr>
-          <w:ilvl w:val="0"/>
-          <w:numId w:val="2"/>
-        </w:numPr>
-        <w:spacing w:after="60" w:line="278"/>
-      </w:pPr>
-      <w:r>
-        <w:t xml:space="preserve">Open the service URL. Every later push to the default branch redeploys automatically; the database keeps its data.</w:t>
+        <w:t xml:space="preserve">Open the service URL. The database loads itself on first boot. Every later push to the default branch redeploys automatically; the database keeps its data.</w:t>
+      </w:r>
+    </w:p>
+    <w:p>
+      <w:pPr>
+        <w:spacing w:after="160" w:line="278"/>
+      </w:pPr>
+      <w:r>
+        <w:t xml:space="preserve">To reset or reload the hosted data by hand, run node db/setup.mjs from a laptop against the database’s external connection string.</w:t>
       </w:r>
     </w:p>
     <w:tbl>
@@ -2781,7 +2944,7 @@
           <w:sz w:val="18"/>
           <w:szCs w:val="18"/>
         </w:rPr>
-        <w:t xml:space="preserve">node db/setup.mjs run once in the Render Shell</w:t>
+        <w:t xml:space="preserve">The first-boot logs — bootstrap loading schema, seed and menu images</w:t>
       </w:r>
     </w:p>
     <w:tbl>

</xml_diff>

<commit_message>
feat(deploy): add a Vercel deployment (SPA on CDN + /api serverless function)
Render's free web service sleeps after ~15 min and takes ~50 s to wake, which
makes a cold link look broken. Vercel is now the primary deploy: the SPA is
served from the CDN and the API runs as one serverless function against Neon.

- server/src/app.js: the Express app, factored out of index.js. index.js is
  now just app.listen() (Render / local); api/serverless.js exports the same
  app as a Vercel function (with an /api-prefix shim).
- bootstrap now runs via an ensureReady() middleware, so the first serverless
  request loads schema + seed before anything queries.
- vercel.json: build client/dist, rewrite /api/* to the function, SPA fallback.
- README + application document + .docx updated: two deployments, Vercel
  primary, with Render's cold start given as the reason.

Co-Authored-By: Claude Sonnet 5 <noreply@anthropic.com>
</commit_message>
<xml_diff>
--- a/docs/Chowly - Application Document.docx
+++ b/docs/Chowly - Application Document.docx
@@ -273,10 +273,25 @@
           <w:b/>
           <w:bCs/>
         </w:rPr>
-        <w:t xml:space="preserve">Deployed application: </w:t>
-      </w:r>
-      <w:r>
-        <w:t xml:space="preserve">____________________  (paste your Render URL)</w:t>
+        <w:t xml:space="preserve">Deployed application (Vercel — primary): </w:t>
+      </w:r>
+      <w:r>
+        <w:t xml:space="preserve">____________________</w:t>
+      </w:r>
+    </w:p>
+    <w:p>
+      <w:pPr>
+        <w:spacing w:after="160" w:line="278"/>
+      </w:pPr>
+      <w:r>
+        <w:rPr>
+          <w:b/>
+          <w:bCs/>
+        </w:rPr>
+        <w:t xml:space="preserve">Deployed application (Render — fallback): </w:t>
+      </w:r>
+      <w:r>
+        <w:t xml:space="preserve">____________________</w:t>
       </w:r>
     </w:p>
     <w:p>
@@ -408,7 +423,7 @@
         <w:t xml:space="preserve">Hosting — </w:t>
       </w:r>
       <w:r>
-        <w:t xml:space="preserve">Render: one managed Postgres instance and one Node web service, wired together by render.yaml.</w:t>
+        <w:t xml:space="preserve">Vercel (SPA on the CDN + the API as a serverless function, Neon Postgres) as the primary link; Render (one Node web service + Render Postgres) as a fallback. See 2.5.</w:t>
       </w:r>
     </w:p>
     <w:p>
@@ -432,7 +447,7 @@
         <w:spacing w:after="160" w:line="278"/>
       </w:pPr>
       <w:r>
-        <w:t xml:space="preserve">In development, one command runs the API on port 3000 and the Vite dev server on port 5173, with Vite proxying /api to Express. In production, the build compiles the client to client/dist and Express serves it with a single-page-app fallback, so the whole application is served from one origin.</w:t>
+        <w:t xml:space="preserve">In development, one command runs the API on port 3000 and the Vite dev server on port 5173, with Vite proxying /api to Express. On Render the build compiles the client to client/dist and Express serves it with a single-page-app fallback; on Vercel the CDN serves client/dist and /api/* is routed to a serverless function. Either way the whole application is one origin (no CORS).</w:t>
       </w:r>
     </w:p>
     <w:p>
@@ -472,7 +487,7 @@
         <w:t xml:space="preserve">server/ </w:t>
       </w:r>
       <w:r>
-        <w:t xml:space="preserve">— the Express JSON API: db.js (one connection pool), bootstrap.js (first-boot schema load), config.js, middleware.js (role guards), and routes for session, menu, and orders.</w:t>
+        <w:t xml:space="preserve">— the Express JSON API: app.js (the app), index.js (app.listen for Render/local), db.js (one connection pool), bootstrap.js (first-boot schema load), config.js, middleware.js (role guards), and routes for session, menu, and orders.</w:t>
       </w:r>
     </w:p>
     <w:p>
@@ -509,10 +524,10 @@
           <w:b/>
           <w:bCs/>
         </w:rPr>
-        <w:t xml:space="preserve">render.yaml, docs/ </w:t>
-      </w:r>
-      <w:r>
-        <w:t xml:space="preserve">— the Render blueprint and this document.</w:t>
+        <w:t xml:space="preserve">render.yaml, vercel.json, api/serverless.js, docs/ </w:t>
+      </w:r>
+      <w:r>
+        <w:t xml:space="preserve">— the two deployment configs, the Vercel function entry, and this document.</w:t>
       </w:r>
     </w:p>
     <w:p>
@@ -2759,7 +2774,7 @@
         <w:spacing w:after="160" w:line="278"/>
       </w:pPr>
       <w:r>
-        <w:t xml:space="preserve">render.yaml is a Render blueprint that creates a free Postgres instance (chowly-db) and a free Node web service (chowly), both in the same region. DATABASE_URL is injected from the database, SESSION_SECRET is generated by Render, and NODE_ENV is set to production. The build command runs "npm install --omit=dev" for the root and server and "npm install --include=dev" for the client before "vite build"; the --include=dev is necessary because Render sets NODE_ENV=production during the build, which would otherwise skip Vite and Tailwind. The health check is a plain liveness check that does not touch the database, so a slow first-boot database cannot fail the deploy. The server sets "trust proxy" and a secure session cookie for HTTPS behind Render’s proxy, and the database layer turns on SSL in production.</w:t>
+        <w:t xml:space="preserve">The application is deployed twice from the same repository. Vercel is the primary link: the SPA is served from the CDN and the API runs as one serverless function against Neon (serverless Postgres). Render is kept as a fallback and runs the same code as a long-lived Node web service against Render Postgres.</w:t>
       </w:r>
     </w:p>
     <w:p>
@@ -2767,7 +2782,14 @@
         <w:spacing w:after="160" w:line="278"/>
       </w:pPr>
       <w:r>
-        <w:t xml:space="preserve">The free tier has no Shell, so server/bootstrap.js loads schema.sql, seed.sql and menu_images.sql automatically the first time the server starts against an empty database. It checks for the menu_item table and is a no-op once it exists, so redeploys never touch data.</w:t>
+        <w:rPr>
+          <w:b/>
+          <w:bCs/>
+        </w:rPr>
+        <w:t xml:space="preserve">Why two. </w:t>
+      </w:r>
+      <w:r>
+        <w:t xml:space="preserve">Render’s free web service sleeps after about 15 minutes idle and takes roughly 50 seconds to wake on the next request, so a facilitator opening a cold link would sit on a blank page for the best part of a minute. Vercel was added as the primary link because its static SPA loads from the CDN instantly and the API function cold-starts in a fraction of a second against Neon’s always-on database. Keeping Render as well shows the same code runs unchanged as a plain server.</w:t>
       </w:r>
     </w:p>
     <w:p>
@@ -2775,46 +2797,7 @@
         <w:spacing w:after="160" w:line="278"/>
       </w:pPr>
       <w:r>
-        <w:t xml:space="preserve">The steps to deploy:</w:t>
-      </w:r>
-    </w:p>
-    <w:p>
-      <w:pPr>
-        <w:pStyle w:val="ListParagraph"/>
-        <w:numPr>
-          <w:ilvl w:val="0"/>
-          <w:numId w:val="2"/>
-        </w:numPr>
-        <w:spacing w:after="60" w:line="278"/>
-      </w:pPr>
-      <w:r>
-        <w:t xml:space="preserve">Push the repository to GitHub.</w:t>
-      </w:r>
-    </w:p>
-    <w:p>
-      <w:pPr>
-        <w:pStyle w:val="ListParagraph"/>
-        <w:numPr>
-          <w:ilvl w:val="0"/>
-          <w:numId w:val="2"/>
-        </w:numPr>
-        <w:spacing w:after="60" w:line="278"/>
-      </w:pPr>
-      <w:r>
-        <w:t xml:space="preserve">In the Render dashboard, choose New + → Blueprint and pick the repository. Render reads render.yaml and creates chowly-db and the chowly web service. Click Apply and wait for the first deploy to go green.</w:t>
-      </w:r>
-    </w:p>
-    <w:p>
-      <w:pPr>
-        <w:pStyle w:val="ListParagraph"/>
-        <w:numPr>
-          <w:ilvl w:val="0"/>
-          <w:numId w:val="2"/>
-        </w:numPr>
-        <w:spacing w:after="60" w:line="278"/>
-      </w:pPr>
-      <w:r>
-        <w:t xml:space="preserve">Open the service URL. The database loads itself on first boot. Every later push to the default branch redeploys automatically; the database keeps its data.</w:t>
+        <w:t xml:space="preserve">The Express app is factored into server/src/app.js (the app) with two thin entry points: server/src/index.js calls app.listen() for Render and local use, and api/serverless.js exports the same app as a Vercel function. server/src/bootstrap.js loads schema.sql, seed.sql and menu_images.sql the first time the app runs against an empty database (checked via the menu_item table; a no-op once it exists), so neither platform needs a shell for the initial data load. db.js turns on SSL when NODE_ENV is production, and the session cookie is secure behind both platforms’ HTTPS.</w:t>
       </w:r>
     </w:p>
     <w:p>
@@ -2822,7 +2805,37 @@
         <w:spacing w:after="160" w:line="278"/>
       </w:pPr>
       <w:r>
-        <w:t xml:space="preserve">To reset or reload the hosted data by hand, run node db/setup.mjs from a laptop against the database’s external connection string.</w:t>
+        <w:rPr>
+          <w:b/>
+          <w:bCs/>
+        </w:rPr>
+        <w:t xml:space="preserve">Render </w:t>
+      </w:r>
+      <w:r>
+        <w:t xml:space="preserve">(render.yaml): a free Postgres instance and a free Node web service in the same region. The build command runs "npm install --include=dev" for the client because Render sets NODE_ENV=production during the build, which would otherwise skip Vite and Tailwind and fail with "vite: not found". The health check is a plain liveness check that does not touch the database, so a slow first-boot database cannot fail the deploy.</w:t>
+      </w:r>
+    </w:p>
+    <w:p>
+      <w:pPr>
+        <w:spacing w:after="160" w:line="278"/>
+      </w:pPr>
+      <w:r>
+        <w:rPr>
+          <w:b/>
+          <w:bCs/>
+        </w:rPr>
+        <w:t xml:space="preserve">Vercel </w:t>
+      </w:r>
+      <w:r>
+        <w:t xml:space="preserve">(vercel.json): client/ is built and served as static output; /api/* is rewritten to the api/serverless.js function; everything else falls back to index.html. DATABASE_URL (a Neon pooled connection string) and SESSION_SECRET are set in the Vercel project; NODE_ENV=production is automatic.</w:t>
+      </w:r>
+    </w:p>
+    <w:p>
+      <w:pPr>
+        <w:spacing w:after="160" w:line="278"/>
+      </w:pPr>
+      <w:r>
+        <w:t xml:space="preserve">To deploy to Vercel: create a free Neon project and copy its pooled connection string; import the GitHub repo at vercel.com/new; add DATABASE_URL and SESSION_SECRET; deploy. The first request loads the schema and seed, then it is instant. To reset either database by hand, run node db/setup.mjs from a laptop against that database’s connection string.</w:t>
       </w:r>
     </w:p>
     <w:tbl>
@@ -2883,7 +2896,7 @@
           <w:sz w:val="18"/>
           <w:szCs w:val="18"/>
         </w:rPr>
-        <w:t xml:space="preserve">The Render Blueprint creating chowly-db and the chowly web service</w:t>
+        <w:t xml:space="preserve">The Vercel project — build settings and DATABASE_URL / SESSION_SECRET</w:t>
       </w:r>
     </w:p>
     <w:tbl>
@@ -2944,7 +2957,7 @@
           <w:sz w:val="18"/>
           <w:szCs w:val="18"/>
         </w:rPr>
-        <w:t xml:space="preserve">The first-boot logs — bootstrap loading schema, seed and menu images</w:t>
+        <w:t xml:space="preserve">The application open at its Vercel URL (loads instantly)</w:t>
       </w:r>
     </w:p>
     <w:tbl>
@@ -3005,237 +3018,7 @@
           <w:sz w:val="18"/>
           <w:szCs w:val="18"/>
         </w:rPr>
-        <w:t xml:space="preserve">The deployed application open at its Render URL</w:t>
-      </w:r>
-    </w:p>
-    <w:p>
-      <w:pPr>
-        <w:pStyle w:val="Heading1"/>
-      </w:pPr>
-      <w:r>
-        <w:t xml:space="preserve">3.0 How AI Was Used</w:t>
-      </w:r>
-    </w:p>
-    <w:p>
-      <w:pPr>
-        <w:spacing w:after="160" w:line="278"/>
-      </w:pPr>
-      <w:r>
-        <w:t xml:space="preserve">The build was done with an AI coding assistant (Claude, via Claude Code).</w:t>
-      </w:r>
-    </w:p>
-    <w:p>
-      <w:pPr>
-        <w:spacing w:after="160" w:line="278"/>
-      </w:pPr>
-      <w:r>
-        <w:rPr>
-          <w:b/>
-          <w:bCs/>
-        </w:rPr>
-        <w:t xml:space="preserve">What it was asked to do</w:t>
-      </w:r>
-      <w:r>
-        <w:t xml:space="preserve"/>
-      </w:r>
-    </w:p>
-    <w:p>
-      <w:pPr>
-        <w:pStyle w:val="ListParagraph"/>
-        <w:numPr>
-          <w:ilvl w:val="0"/>
-          <w:numId w:val="1"/>
-        </w:numPr>
-        <w:spacing w:after="60" w:line="278"/>
-      </w:pPr>
-      <w:r>
-        <w:t xml:space="preserve">Read the three source documents (the build brief, the original model, the assessment feedback) and the three SQL files, then propose a staged plan.</w:t>
-      </w:r>
-    </w:p>
-    <w:p>
-      <w:pPr>
-        <w:pStyle w:val="ListParagraph"/>
-        <w:numPr>
-          <w:ilvl w:val="0"/>
-          <w:numId w:val="1"/>
-        </w:numPr>
-        <w:spacing w:after="60" w:line="278"/>
-      </w:pPr>
-      <w:r>
-        <w:t xml:space="preserve">Scaffold the repository, write the Express API route by route, and build the React client screen by screen, styled after the Figma Make design.</w:t>
-      </w:r>
-    </w:p>
-    <w:p>
-      <w:pPr>
-        <w:pStyle w:val="ListParagraph"/>
-        <w:numPr>
-          <w:ilvl w:val="0"/>
-          <w:numId w:val="1"/>
-        </w:numPr>
-        <w:spacing w:after="60" w:line="278"/>
-      </w:pPr>
-      <w:r>
-        <w:t xml:space="preserve">Deliver the work as a readable sequence of git commits, then apply a long run of small follow-up changes, each as its own commit.</w:t>
-      </w:r>
-    </w:p>
-    <w:p>
-      <w:pPr>
-        <w:spacing w:after="160" w:line="278"/>
-      </w:pPr>
-      <w:r>
-        <w:rPr>
-          <w:b/>
-          <w:bCs/>
-        </w:rPr>
-        <w:t xml:space="preserve">What was accepted</w:t>
-      </w:r>
-      <w:r>
-        <w:t xml:space="preserve"/>
-      </w:r>
-    </w:p>
-    <w:p>
-      <w:pPr>
-        <w:pStyle w:val="ListParagraph"/>
-        <w:numPr>
-          <w:ilvl w:val="0"/>
-          <w:numId w:val="1"/>
-        </w:numPr>
-        <w:spacing w:after="60" w:line="278"/>
-      </w:pPr>
-      <w:r>
-        <w:t xml:space="preserve">The overall shape: the client / server split, the session role switch, the API surface, and the Tailwind design tokens taken from the Figma design.</w:t>
-      </w:r>
-    </w:p>
-    <w:p>
-      <w:pPr>
-        <w:pStyle w:val="ListParagraph"/>
-        <w:numPr>
-          <w:ilvl w:val="0"/>
-          <w:numId w:val="1"/>
-        </w:numPr>
-        <w:spacing w:after="60" w:line="278"/>
-      </w:pPr>
-      <w:r>
-        <w:t xml:space="preserve">The transactional order-placement query, the parallel max(kitchen, bar) wait estimate, and the "on conflict" rating upsert.</w:t>
-      </w:r>
-    </w:p>
-    <w:p>
-      <w:pPr>
-        <w:pStyle w:val="ListParagraph"/>
-        <w:numPr>
-          <w:ilvl w:val="0"/>
-          <w:numId w:val="1"/>
-        </w:numPr>
-        <w:spacing w:after="60" w:line="278"/>
-      </w:pPr>
-      <w:r>
-        <w:t xml:space="preserve">A decision to reset the messy early git history to a clean, staged commit sequence (the pre-reset history is kept on an archive branch).</w:t>
-      </w:r>
-    </w:p>
-    <w:p>
-      <w:pPr>
-        <w:pStyle w:val="ListParagraph"/>
-        <w:numPr>
-          <w:ilvl w:val="0"/>
-          <w:numId w:val="1"/>
-        </w:numPr>
-        <w:spacing w:after="60" w:line="278"/>
-      </w:pPr>
-      <w:r>
-        <w:t xml:space="preserve">Later feature requests taken as-is: a welcome landing page; order lookup by name and table; a live MM:SS countdown; the logo linking home; the table picker as a 1–20 dropdown; the waiter opening a paid card for a full summary; optional dish photos.</w:t>
-      </w:r>
-    </w:p>
-    <w:p>
-      <w:pPr>
-        <w:spacing w:after="160" w:line="278"/>
-      </w:pPr>
-      <w:r>
-        <w:rPr>
-          <w:b/>
-          <w:bCs/>
-        </w:rPr>
-        <w:t xml:space="preserve">What was rejected or corrected</w:t>
-      </w:r>
-      <w:r>
-        <w:t xml:space="preserve"/>
-      </w:r>
-    </w:p>
-    <w:p>
-      <w:pPr>
-        <w:pStyle w:val="ListParagraph"/>
-        <w:numPr>
-          <w:ilvl w:val="0"/>
-          <w:numId w:val="1"/>
-        </w:numPr>
-        <w:spacing w:after="60" w:line="278"/>
-      </w:pPr>
-      <w:r>
-        <w:t xml:space="preserve">The first pass had the role toggle wipe the customer’s session on every switch, so a customer who peeked at the waiter view lost their order. Changed so the toggle only flips the view and keeps the identity and current order.</w:t>
-      </w:r>
-    </w:p>
-    <w:p>
-      <w:pPr>
-        <w:pStyle w:val="ListParagraph"/>
-        <w:numPr>
-          <w:ilvl w:val="0"/>
-          <w:numId w:val="1"/>
-        </w:numPr>
-        <w:spacing w:after="60" w:line="278"/>
-      </w:pPr>
-      <w:r>
-        <w:t xml:space="preserve">db/setup.mjs first shelled out to psql, which a Render shell does not have. Rewritten to run the .sql files through the pg driver.</w:t>
-      </w:r>
-    </w:p>
-    <w:p>
-      <w:pPr>
-        <w:pStyle w:val="ListParagraph"/>
-        <w:numPr>
-          <w:ilvl w:val="0"/>
-          <w:numId w:val="1"/>
-        </w:numPr>
-        <w:spacing w:after="60" w:line="278"/>
-      </w:pPr>
-      <w:r>
-        <w:t xml:space="preserve">The cart drawer widened the page until overflow was clipped; the order item table had to be made to scroll inside its card on mobile.</w:t>
-      </w:r>
-    </w:p>
-    <w:p>
-      <w:pPr>
-        <w:pStyle w:val="ListParagraph"/>
-        <w:numPr>
-          <w:ilvl w:val="0"/>
-          <w:numId w:val="1"/>
-        </w:numPr>
-        <w:spacing w:after="60" w:line="278"/>
-      </w:pPr>
-      <w:r>
-        <w:t xml:space="preserve">Payment was first allowed from either role. Corrected to waiter-only, with the waiter choosing the method the guest used.</w:t>
-      </w:r>
-    </w:p>
-    <w:p>
-      <w:pPr>
-        <w:pStyle w:val="ListParagraph"/>
-        <w:numPr>
-          <w:ilvl w:val="0"/>
-          <w:numId w:val="1"/>
-        </w:numPr>
-        <w:spacing w:after="60" w:line="278"/>
-      </w:pPr>
-      <w:r>
-        <w:t xml:space="preserve">image_url was initially left out to keep the SQL files untouched; when photos were wanted it was added to schema.sql, with the URLs kept in a separate menu_images.sql.</w:t>
-      </w:r>
-    </w:p>
-    <w:p>
-      <w:pPr>
-        <w:pStyle w:val="ListParagraph"/>
-        <w:numPr>
-          <w:ilvl w:val="0"/>
-          <w:numId w:val="1"/>
-        </w:numPr>
-        <w:spacing w:after="60" w:line="278"/>
-      </w:pPr>
-      <w:r>
-        <w:t xml:space="preserve">Small fixes on request: reloading the menu no longer bounces to the welcome page; the "back to your order" button was removed from the welcome page.</w:t>
+        <w:t xml:space="preserve">The Render Blueprint creating chowly-db and the chowly web service</w:t>
       </w:r>
     </w:p>
     <w:tbl>
@@ -3296,7 +3079,250 @@
           <w:sz w:val="18"/>
           <w:szCs w:val="18"/>
         </w:rPr>
-        <w:t xml:space="preserve">A section of the AI session — a feature request and the change it produced</w:t>
+        <w:t xml:space="preserve">The application open at its Render URL</w:t>
+      </w:r>
+    </w:p>
+    <w:p>
+      <w:pPr>
+        <w:pStyle w:val="Heading1"/>
+      </w:pPr>
+      <w:r>
+        <w:t xml:space="preserve">3.0 How AI Was Used</w:t>
+      </w:r>
+    </w:p>
+    <w:p>
+      <w:pPr>
+        <w:spacing w:after="160" w:line="278"/>
+      </w:pPr>
+      <w:r>
+        <w:t xml:space="preserve">The build was done with an AI coding assistant (Claude, via Claude Code).</w:t>
+      </w:r>
+    </w:p>
+    <w:p>
+      <w:pPr>
+        <w:spacing w:after="160" w:line="278"/>
+      </w:pPr>
+      <w:r>
+        <w:rPr>
+          <w:b/>
+          <w:bCs/>
+        </w:rPr>
+        <w:t xml:space="preserve">What it was asked to do</w:t>
+      </w:r>
+      <w:r>
+        <w:t xml:space="preserve"/>
+      </w:r>
+    </w:p>
+    <w:p>
+      <w:pPr>
+        <w:pStyle w:val="ListParagraph"/>
+        <w:numPr>
+          <w:ilvl w:val="0"/>
+          <w:numId w:val="1"/>
+        </w:numPr>
+        <w:spacing w:after="60" w:line="278"/>
+      </w:pPr>
+      <w:r>
+        <w:t xml:space="preserve">Read the three source documents (the build brief, the original model, the assessment feedback) and the three SQL files, then propose a staged plan.</w:t>
+      </w:r>
+    </w:p>
+    <w:p>
+      <w:pPr>
+        <w:pStyle w:val="ListParagraph"/>
+        <w:numPr>
+          <w:ilvl w:val="0"/>
+          <w:numId w:val="1"/>
+        </w:numPr>
+        <w:spacing w:after="60" w:line="278"/>
+      </w:pPr>
+      <w:r>
+        <w:t xml:space="preserve">Scaffold the repository, write the Express API route by route, and build the React client screen by screen, styled after the Figma Make design.</w:t>
+      </w:r>
+    </w:p>
+    <w:p>
+      <w:pPr>
+        <w:pStyle w:val="ListParagraph"/>
+        <w:numPr>
+          <w:ilvl w:val="0"/>
+          <w:numId w:val="1"/>
+        </w:numPr>
+        <w:spacing w:after="60" w:line="278"/>
+      </w:pPr>
+      <w:r>
+        <w:t xml:space="preserve">Deliver the work as a readable sequence of git commits, then apply a long run of small follow-up changes, each as its own commit.</w:t>
+      </w:r>
+    </w:p>
+    <w:p>
+      <w:pPr>
+        <w:spacing w:after="160" w:line="278"/>
+      </w:pPr>
+      <w:r>
+        <w:rPr>
+          <w:b/>
+          <w:bCs/>
+        </w:rPr>
+        <w:t xml:space="preserve">What was accepted</w:t>
+      </w:r>
+      <w:r>
+        <w:t xml:space="preserve"/>
+      </w:r>
+    </w:p>
+    <w:p>
+      <w:pPr>
+        <w:pStyle w:val="ListParagraph"/>
+        <w:numPr>
+          <w:ilvl w:val="0"/>
+          <w:numId w:val="1"/>
+        </w:numPr>
+        <w:spacing w:after="60" w:line="278"/>
+      </w:pPr>
+      <w:r>
+        <w:t xml:space="preserve">The overall shape: the client / server split, the session role switch, the API surface, and the Tailwind design tokens taken from the Figma design.</w:t>
+      </w:r>
+    </w:p>
+    <w:p>
+      <w:pPr>
+        <w:pStyle w:val="ListParagraph"/>
+        <w:numPr>
+          <w:ilvl w:val="0"/>
+          <w:numId w:val="1"/>
+        </w:numPr>
+        <w:spacing w:after="60" w:line="278"/>
+      </w:pPr>
+      <w:r>
+        <w:t xml:space="preserve">The transactional order-placement query, the parallel max(kitchen, bar) wait estimate, and the "on conflict" rating upsert.</w:t>
+      </w:r>
+    </w:p>
+    <w:p>
+      <w:pPr>
+        <w:pStyle w:val="ListParagraph"/>
+        <w:numPr>
+          <w:ilvl w:val="0"/>
+          <w:numId w:val="1"/>
+        </w:numPr>
+        <w:spacing w:after="60" w:line="278"/>
+      </w:pPr>
+      <w:r>
+        <w:t xml:space="preserve">A decision to reset the messy early git history to a clean, staged commit sequence (the pre-reset history is kept on an archive branch).</w:t>
+      </w:r>
+    </w:p>
+    <w:p>
+      <w:pPr>
+        <w:pStyle w:val="ListParagraph"/>
+        <w:numPr>
+          <w:ilvl w:val="0"/>
+          <w:numId w:val="1"/>
+        </w:numPr>
+        <w:spacing w:after="60" w:line="278"/>
+      </w:pPr>
+      <w:r>
+        <w:t xml:space="preserve">Later feature requests taken as-is: a welcome landing page; order lookup by name and table; a live MM:SS countdown; the logo linking home; the table picker as a 1–20 dropdown; the waiter opening a paid card for a full summary; optional dish photos; a second deployment on Vercel.</w:t>
+      </w:r>
+    </w:p>
+    <w:p>
+      <w:pPr>
+        <w:spacing w:after="160" w:line="278"/>
+      </w:pPr>
+      <w:r>
+        <w:rPr>
+          <w:b/>
+          <w:bCs/>
+        </w:rPr>
+        <w:t xml:space="preserve">What was rejected or corrected</w:t>
+      </w:r>
+      <w:r>
+        <w:t xml:space="preserve"/>
+      </w:r>
+    </w:p>
+    <w:p>
+      <w:pPr>
+        <w:pStyle w:val="ListParagraph"/>
+        <w:numPr>
+          <w:ilvl w:val="0"/>
+          <w:numId w:val="1"/>
+        </w:numPr>
+        <w:spacing w:after="60" w:line="278"/>
+      </w:pPr>
+      <w:r>
+        <w:t xml:space="preserve">The first pass had the role toggle wipe the customer’s session on every switch, so a customer who peeked at the waiter view lost their order. Changed so the toggle only flips the view and keeps the identity and current order.</w:t>
+      </w:r>
+    </w:p>
+    <w:p>
+      <w:pPr>
+        <w:pStyle w:val="ListParagraph"/>
+        <w:numPr>
+          <w:ilvl w:val="0"/>
+          <w:numId w:val="1"/>
+        </w:numPr>
+        <w:spacing w:after="60" w:line="278"/>
+      </w:pPr>
+      <w:r>
+        <w:t xml:space="preserve">db/setup.mjs first shelled out to psql, which a Render shell does not have. Rewritten to run the .sql files through the pg driver.</w:t>
+      </w:r>
+    </w:p>
+    <w:p>
+      <w:pPr>
+        <w:pStyle w:val="ListParagraph"/>
+        <w:numPr>
+          <w:ilvl w:val="0"/>
+          <w:numId w:val="1"/>
+        </w:numPr>
+        <w:spacing w:after="60" w:line="278"/>
+      </w:pPr>
+      <w:r>
+        <w:t xml:space="preserve">The cart drawer widened the page until overflow was clipped; the order item table had to be made to scroll inside its card on mobile.</w:t>
+      </w:r>
+    </w:p>
+    <w:p>
+      <w:pPr>
+        <w:pStyle w:val="ListParagraph"/>
+        <w:numPr>
+          <w:ilvl w:val="0"/>
+          <w:numId w:val="1"/>
+        </w:numPr>
+        <w:spacing w:after="60" w:line="278"/>
+      </w:pPr>
+      <w:r>
+        <w:t xml:space="preserve">Payment was first allowed from either role. Corrected to waiter-only, with the waiter choosing the method the guest used.</w:t>
+      </w:r>
+    </w:p>
+    <w:p>
+      <w:pPr>
+        <w:pStyle w:val="ListParagraph"/>
+        <w:numPr>
+          <w:ilvl w:val="0"/>
+          <w:numId w:val="1"/>
+        </w:numPr>
+        <w:spacing w:after="60" w:line="278"/>
+      </w:pPr>
+      <w:r>
+        <w:t xml:space="preserve">image_url was initially left out to keep the SQL files untouched; when photos were wanted it was added to schema.sql, with the URLs kept in a separate menu_images.sql.</w:t>
+      </w:r>
+    </w:p>
+    <w:p>
+      <w:pPr>
+        <w:pStyle w:val="ListParagraph"/>
+        <w:numPr>
+          <w:ilvl w:val="0"/>
+          <w:numId w:val="1"/>
+        </w:numPr>
+        <w:spacing w:after="60" w:line="278"/>
+      </w:pPr>
+      <w:r>
+        <w:t xml:space="preserve">Small fixes on request: reloading the menu no longer bounces to the welcome page; the "back to your order" button was removed from the welcome page.</w:t>
+      </w:r>
+    </w:p>
+    <w:p>
+      <w:pPr>
+        <w:pStyle w:val="ListParagraph"/>
+        <w:numPr>
+          <w:ilvl w:val="0"/>
+          <w:numId w:val="1"/>
+        </w:numPr>
+        <w:spacing w:after="60" w:line="278"/>
+      </w:pPr>
+      <w:r>
+        <w:t xml:space="preserve">The first Render deploy failed because the build skipped the client’s dev dependencies, and the mobile layout zoomed out because a grid track grew past the viewport width. Both were found by testing the deployed build, not by review.</w:t>
       </w:r>
     </w:p>
     <w:tbl>
@@ -3357,31 +3383,7 @@
           <w:sz w:val="18"/>
           <w:szCs w:val="18"/>
         </w:rPr>
-        <w:t xml:space="preserve">The staged git commit history (git log --oneline)</w:t>
-      </w:r>
-    </w:p>
-    <w:p>
-      <w:pPr>
-        <w:pStyle w:val="Heading1"/>
-      </w:pPr>
-      <w:r>
-        <w:t xml:space="preserve">4.0 What the Application Does, Step by Step</w:t>
-      </w:r>
-    </w:p>
-    <w:p>
-      <w:pPr>
-        <w:pStyle w:val="Heading3"/>
-      </w:pPr>
-      <w:r>
-        <w:t xml:space="preserve">4.1 Welcome Screen</w:t>
-      </w:r>
-    </w:p>
-    <w:p>
-      <w:pPr>
-        <w:spacing w:after="160" w:line="278"/>
-      </w:pPr>
-      <w:r>
-        <w:t xml:space="preserve">Opening the app shows a short welcome page for the active venue — its name and address, a one-line explanation of how ordering works, and a "View the menu" button. It is shown only to a fresh customer; someone with an order already in progress goes straight to their tracking screen, and the waiter view skips it. Once the customer taps "View the menu" the browser tab remembers it, so reloading mid-browse stays on the menu.</w:t>
+        <w:t xml:space="preserve">A section of the AI session — a feature request and the change it produced</w:t>
       </w:r>
     </w:p>
     <w:tbl>
@@ -3442,7 +3444,15 @@
           <w:sz w:val="18"/>
           <w:szCs w:val="18"/>
         </w:rPr>
-        <w:t xml:space="preserve">The welcome screen for the active venue</w:t>
+        <w:t xml:space="preserve">The staged git commit history (git log --oneline)</w:t>
+      </w:r>
+    </w:p>
+    <w:p>
+      <w:pPr>
+        <w:pStyle w:val="Heading1"/>
+      </w:pPr>
+      <w:r>
+        <w:t xml:space="preserve">4.0 What the Application Does, Step by Step</w:t>
       </w:r>
     </w:p>
     <w:p>
@@ -3450,7 +3460,7 @@
         <w:pStyle w:val="Heading3"/>
       </w:pPr>
       <w:r>
-        <w:t xml:space="preserve">4.2 Menu Browsing</w:t>
+        <w:t xml:space="preserve">4.1 Welcome Screen</w:t>
       </w:r>
     </w:p>
     <w:p>
@@ -3458,7 +3468,7 @@
         <w:spacing w:after="160" w:line="278"/>
       </w:pPr>
       <w:r>
-        <w:t xml:space="preserve">"View the menu" opens the menu for the active venue — every available item, with a BROWSE sidebar listing All and the five categories (Starters, Main Courses, Sides, Desserts, Drinks) with a live count each. Each card shows the preparation time, the price in naira, the name, a short description, and a dish photo where one is set. No identity is needed to browse.</w:t>
+        <w:t xml:space="preserve">Opening the app shows a short welcome page for the active venue — its name and address, a one-line explanation of how ordering works, and a "View the menu" button. It is shown only to a fresh customer; someone with an order already in progress goes straight to their tracking screen, and the waiter view skips it. Once the customer taps "View the menu" the browser tab remembers it, so reloading mid-browse stays on the menu.</w:t>
       </w:r>
     </w:p>
     <w:tbl>
@@ -3519,7 +3529,7 @@
           <w:sz w:val="18"/>
           <w:szCs w:val="18"/>
         </w:rPr>
-        <w:t xml:space="preserve">The menu — category sidebar, dish photos, prep time and price on each card</w:t>
+        <w:t xml:space="preserve">The welcome screen for the active venue</w:t>
       </w:r>
     </w:p>
     <w:p>
@@ -3527,7 +3537,7 @@
         <w:pStyle w:val="Heading3"/>
       </w:pPr>
       <w:r>
-        <w:t xml:space="preserve">4.3 Placing an Order</w:t>
+        <w:t xml:space="preserve">4.2 Menu Browsing</w:t>
       </w:r>
     </w:p>
     <w:p>
@@ -3535,46 +3545,7 @@
         <w:spacing w:after="160" w:line="278"/>
       </w:pPr>
       <w:r>
-        <w:t xml:space="preserve">"+ Add to Order" puts an item in the cart, and the header shows the count. Opening the cart lists the lines with quantity steppers and a running total. "Continue" asks for a name (optional) and the table (a dropdown of tables 1–20, required). "Place order" then:</w:t>
-      </w:r>
-    </w:p>
-    <w:p>
-      <w:pPr>
-        <w:pStyle w:val="ListParagraph"/>
-        <w:numPr>
-          <w:ilvl w:val="0"/>
-          <w:numId w:val="3"/>
-        </w:numPr>
-        <w:spacing w:after="60" w:line="278"/>
-      </w:pPr>
-      <w:r>
-        <w:t xml:space="preserve">creates the customer row and stores the identity in the session;</w:t>
-      </w:r>
-    </w:p>
-    <w:p>
-      <w:pPr>
-        <w:pStyle w:val="ListParagraph"/>
-        <w:numPr>
-          <w:ilvl w:val="0"/>
-          <w:numId w:val="3"/>
-        </w:numPr>
-        <w:spacing w:after="60" w:line="278"/>
-      </w:pPr>
-      <w:r>
-        <w:t xml:space="preserve">inserts the order (status pending) and one order_item per line, each with a snapshot of the current price;</w:t>
-      </w:r>
-    </w:p>
-    <w:p>
-      <w:pPr>
-        <w:pStyle w:val="ListParagraph"/>
-        <w:numPr>
-          <w:ilvl w:val="0"/>
-          <w:numId w:val="3"/>
-        </w:numPr>
-        <w:spacing w:after="60" w:line="278"/>
-      </w:pPr>
-      <w:r>
-        <w:t xml:space="preserve">sets the estimated wait to the larger of the kitchen queue and the bar queue, since the two prepare in parallel.</w:t>
+        <w:t xml:space="preserve">"View the menu" opens the menu for the active venue — every available item, with a BROWSE sidebar listing All and the five categories (Starters, Main Courses, Sides, Desserts, Drinks) with a live count each. Each card shows the preparation time, the price in naira, the name, a short description, and a dish photo where one is set. No identity is needed to browse.</w:t>
       </w:r>
     </w:p>
     <w:tbl>
@@ -3635,7 +3606,7 @@
           <w:sz w:val="18"/>
           <w:szCs w:val="18"/>
         </w:rPr>
-        <w:t xml:space="preserve">The cart, with the table dropdown, at checkout</w:t>
+        <w:t xml:space="preserve">The menu — category sidebar, dish photos, prep time and price on each card</w:t>
       </w:r>
     </w:p>
     <w:p>
@@ -3643,7 +3614,7 @@
         <w:pStyle w:val="Heading3"/>
       </w:pPr>
       <w:r>
-        <w:t xml:space="preserve">4.4 Order Tracking and the Wait Countdown</w:t>
+        <w:t xml:space="preserve">4.3 Placing an Order</w:t>
       </w:r>
     </w:p>
     <w:p>
@@ -3651,15 +3622,46 @@
         <w:spacing w:after="160" w:line="278"/>
       </w:pPr>
       <w:r>
-        <w:t xml:space="preserve">The customer lands on the order tracking screen: the status, a live MM:SS countdown to the estimated ready time (which flips to "running late" once the estimate is passed, then to "served in N minutes" afterwards), the itemised list with the total, and "who’s handling this" (empty until a waiter picks it up). The screen polls every five seconds and survives a page refresh.</w:t>
-      </w:r>
-    </w:p>
-    <w:p>
-      <w:pPr>
-        <w:spacing w:after="160" w:line="278"/>
-      </w:pPr>
-      <w:r>
-        <w:t xml:space="preserve">A customer who has lost their session — closed the tab, or is on another device — can get back to this screen from the welcome page. "Already ordered? Check your order status" asks for the name and table used on the order and reopens its tracking screen.</w:t>
+        <w:t xml:space="preserve">"+ Add to Order" puts an item in the cart, and the header shows the count. Opening the cart lists the lines with quantity steppers and a running total. "Continue" asks for a name (optional) and the table (a dropdown of tables 1–20, required). "Place order" then:</w:t>
+      </w:r>
+    </w:p>
+    <w:p>
+      <w:pPr>
+        <w:pStyle w:val="ListParagraph"/>
+        <w:numPr>
+          <w:ilvl w:val="0"/>
+          <w:numId w:val="2"/>
+        </w:numPr>
+        <w:spacing w:after="60" w:line="278"/>
+      </w:pPr>
+      <w:r>
+        <w:t xml:space="preserve">creates the customer row and stores the identity in the session;</w:t>
+      </w:r>
+    </w:p>
+    <w:p>
+      <w:pPr>
+        <w:pStyle w:val="ListParagraph"/>
+        <w:numPr>
+          <w:ilvl w:val="0"/>
+          <w:numId w:val="2"/>
+        </w:numPr>
+        <w:spacing w:after="60" w:line="278"/>
+      </w:pPr>
+      <w:r>
+        <w:t xml:space="preserve">inserts the order (status pending) and one order_item per line, each with a snapshot of the current price;</w:t>
+      </w:r>
+    </w:p>
+    <w:p>
+      <w:pPr>
+        <w:pStyle w:val="ListParagraph"/>
+        <w:numPr>
+          <w:ilvl w:val="0"/>
+          <w:numId w:val="2"/>
+        </w:numPr>
+        <w:spacing w:after="60" w:line="278"/>
+      </w:pPr>
+      <w:r>
+        <w:t xml:space="preserve">sets the estimated wait to the larger of the kitchen queue and the bar queue, since the two prepare in parallel.</w:t>
       </w:r>
     </w:p>
     <w:tbl>
@@ -3720,7 +3722,31 @@
           <w:sz w:val="18"/>
           <w:szCs w:val="18"/>
         </w:rPr>
-        <w:t xml:space="preserve">The order tracking screen with the live MM:SS countdown</w:t>
+        <w:t xml:space="preserve">The cart, with the table dropdown, at checkout</w:t>
+      </w:r>
+    </w:p>
+    <w:p>
+      <w:pPr>
+        <w:pStyle w:val="Heading3"/>
+      </w:pPr>
+      <w:r>
+        <w:t xml:space="preserve">4.4 Order Tracking and the Wait Countdown</w:t>
+      </w:r>
+    </w:p>
+    <w:p>
+      <w:pPr>
+        <w:spacing w:after="160" w:line="278"/>
+      </w:pPr>
+      <w:r>
+        <w:t xml:space="preserve">The customer lands on the order tracking screen: the status, a live MM:SS countdown to the estimated ready time (which flips to "running late" once the estimate is passed, then to "served in N minutes" afterwards), the itemised list with the total, and "who’s handling this" (empty until a waiter picks it up). The screen polls every five seconds and survives a page refresh.</w:t>
+      </w:r>
+    </w:p>
+    <w:p>
+      <w:pPr>
+        <w:spacing w:after="160" w:line="278"/>
+      </w:pPr>
+      <w:r>
+        <w:t xml:space="preserve">A customer who has lost their session — closed the tab, or is on another device — can get back to this screen from the welcome page. "Already ordered? Check your order status" asks for the name and table used on the order and reopens its tracking screen.</w:t>
       </w:r>
     </w:p>
     <w:tbl>
@@ -3781,31 +3807,7 @@
           <w:sz w:val="18"/>
           <w:szCs w:val="18"/>
         </w:rPr>
-        <w:t xml:space="preserve">Checking an existing order by name and table</w:t>
-      </w:r>
-    </w:p>
-    <w:p>
-      <w:pPr>
-        <w:pStyle w:val="Heading3"/>
-      </w:pPr>
-      <w:r>
-        <w:t xml:space="preserve">4.5 Order Assignment (Waiter)</w:t>
-      </w:r>
-    </w:p>
-    <w:p>
-      <w:pPr>
-        <w:spacing w:after="160" w:line="278"/>
-      </w:pPr>
-      <w:r>
-        <w:t xml:space="preserve">Switching to Waiter shows the order board, sorted pending → preparing → served → paid. Every card lists the ordered items with their subtotals and the order total. A pending order has three dropdowns — waiter, chef, bartender — filled from the seeded staff lists. "Confirm assignment" records the three on the order, moves it to preparing, and stamps prep_start_time on every item. A preparing order shows the assigned team and a "Mark served" button, which sets the status to served and stamps served_at, actual_wait_minutes and prep_end_time.</w:t>
-      </w:r>
-    </w:p>
-    <w:p>
-      <w:pPr>
-        <w:spacing w:after="160" w:line="278"/>
-      </w:pPr>
-      <w:r>
-        <w:t xml:space="preserve">A paid card is collapsible: opening it fetches the full order and shows a summary — placed / served / paid times, the prep team, the itemised bill, the payment (amount, method and time) with the pretend badge, and any complaint (with its resolution) and rating.</w:t>
+        <w:t xml:space="preserve">The order tracking screen with the live MM:SS countdown</w:t>
       </w:r>
     </w:p>
     <w:tbl>
@@ -3866,7 +3868,31 @@
           <w:sz w:val="18"/>
           <w:szCs w:val="18"/>
         </w:rPr>
-        <w:t xml:space="preserve">The waiter order board, with each card’s items and total</w:t>
+        <w:t xml:space="preserve">Checking an existing order by name and table</w:t>
+      </w:r>
+    </w:p>
+    <w:p>
+      <w:pPr>
+        <w:pStyle w:val="Heading3"/>
+      </w:pPr>
+      <w:r>
+        <w:t xml:space="preserve">4.5 Order Assignment (Waiter)</w:t>
+      </w:r>
+    </w:p>
+    <w:p>
+      <w:pPr>
+        <w:spacing w:after="160" w:line="278"/>
+      </w:pPr>
+      <w:r>
+        <w:t xml:space="preserve">Switching to Waiter shows the order board, sorted pending → preparing → served → paid. Every card lists the ordered items with their subtotals and the order total. A pending order has three dropdowns — waiter, chef, bartender — filled from the seeded staff lists. "Confirm assignment" records the three on the order, moves it to preparing, and stamps prep_start_time on every item. A preparing order shows the assigned team and a "Mark served" button, which sets the status to served and stamps served_at, actual_wait_minutes and prep_end_time.</w:t>
+      </w:r>
+    </w:p>
+    <w:p>
+      <w:pPr>
+        <w:spacing w:after="160" w:line="278"/>
+      </w:pPr>
+      <w:r>
+        <w:t xml:space="preserve">A paid card is collapsible: opening it fetches the full order and shows a summary — placed / served / paid times, the prep team, the itemised bill, the payment (amount, method and time) with the pretend badge, and any complaint (with its resolution) and rating.</w:t>
       </w:r>
     </w:p>
     <w:tbl>
@@ -3927,7 +3953,7 @@
           <w:sz w:val="18"/>
           <w:szCs w:val="18"/>
         </w:rPr>
-        <w:t xml:space="preserve">Assigning a waiter, chef and bartender to a pending order</w:t>
+        <w:t xml:space="preserve">The waiter order board, with each card’s items and total</w:t>
       </w:r>
     </w:p>
     <w:tbl>
@@ -3988,23 +4014,7 @@
           <w:sz w:val="18"/>
           <w:szCs w:val="18"/>
         </w:rPr>
-        <w:t xml:space="preserve">A paid order opened for its full summary, including the payment method used</w:t>
-      </w:r>
-    </w:p>
-    <w:p>
-      <w:pPr>
-        <w:pStyle w:val="Heading3"/>
-      </w:pPr>
-      <w:r>
-        <w:t xml:space="preserve">4.6 Complaint and Rating</w:t>
-      </w:r>
-    </w:p>
-    <w:p>
-      <w:pPr>
-        <w:spacing w:after="160" w:line="278"/>
-      </w:pPr>
-      <w:r>
-        <w:t xml:space="preserve">While an order is active the customer sees a "Taking too long?" box. Submitting it stores a complaint (status open) against the order; it then shows on the order for the customer and as a red "complaint" flag with the text on the waiter’s board, where "Mark complaint resolved" closes it and records resolved_by_waiter_id. Once the order is served the customer can leave a 1–5 star rating with an optional comment; re-rating replaces the previous one.</w:t>
+        <w:t xml:space="preserve">Assigning a waiter, chef and bartender to a pending order</w:t>
       </w:r>
     </w:p>
     <w:tbl>
@@ -4065,7 +4075,23 @@
           <w:sz w:val="18"/>
           <w:szCs w:val="18"/>
         </w:rPr>
-        <w:t xml:space="preserve">The customer filing a complaint on a delayed order</w:t>
+        <w:t xml:space="preserve">A paid order opened for its full summary, including the payment method used</w:t>
+      </w:r>
+    </w:p>
+    <w:p>
+      <w:pPr>
+        <w:pStyle w:val="Heading3"/>
+      </w:pPr>
+      <w:r>
+        <w:t xml:space="preserve">4.6 Complaint and Rating</w:t>
+      </w:r>
+    </w:p>
+    <w:p>
+      <w:pPr>
+        <w:spacing w:after="160" w:line="278"/>
+      </w:pPr>
+      <w:r>
+        <w:t xml:space="preserve">While an order is active the customer sees a "Taking too long?" box. Submitting it stores a complaint (status open) against the order; it then shows on the order for the customer and as a red "complaint" flag with the text on the waiter’s board, where "Mark complaint resolved" closes it and records resolved_by_waiter_id. Once the order is served the customer can leave a 1–5 star rating with an optional comment; re-rating replaces the previous one.</w:t>
       </w:r>
     </w:p>
     <w:tbl>
@@ -4126,23 +4152,7 @@
           <w:sz w:val="18"/>
           <w:szCs w:val="18"/>
         </w:rPr>
-        <w:t xml:space="preserve">A 1–5 star rating on a served order</w:t>
-      </w:r>
-    </w:p>
-    <w:p>
-      <w:pPr>
-        <w:pStyle w:val="Heading3"/>
-      </w:pPr>
-      <w:r>
-        <w:t xml:space="preserve">4.7 Payment</w:t>
-      </w:r>
-    </w:p>
-    <w:p>
-      <w:pPr>
-        <w:spacing w:after="160" w:line="278"/>
-      </w:pPr>
-      <w:r>
-        <w:t xml:space="preserve">Payment is taken by the waiter on the served order — the customer’s screen only shows the total and a note that the waiter will collect it. On the board the waiter picks the method the guest used (cash, card or transfer) and confirms; that inserts a payment row (marked pretend, amount from the item subtotals, received_by_waiter_id set to the order’s waiter, method set to the chosen one) and moves the order to paid. Both screens then show the paid amount with a clear "PRETEND PAYMENT — NO REAL MONEY MOVED" badge.</w:t>
+        <w:t xml:space="preserve">The customer filing a complaint on a delayed order</w:t>
       </w:r>
     </w:p>
     <w:tbl>
@@ -4203,7 +4213,23 @@
           <w:sz w:val="18"/>
           <w:szCs w:val="18"/>
         </w:rPr>
-        <w:t xml:space="preserve">The waiter taking payment — choosing Cash / Card / Transfer</w:t>
+        <w:t xml:space="preserve">A 1–5 star rating on a served order</w:t>
+      </w:r>
+    </w:p>
+    <w:p>
+      <w:pPr>
+        <w:pStyle w:val="Heading3"/>
+      </w:pPr>
+      <w:r>
+        <w:t xml:space="preserve">4.7 Payment</w:t>
+      </w:r>
+    </w:p>
+    <w:p>
+      <w:pPr>
+        <w:spacing w:after="160" w:line="278"/>
+      </w:pPr>
+      <w:r>
+        <w:t xml:space="preserve">Payment is taken by the waiter on the served order — the customer’s screen only shows the total and a note that the waiter will collect it. On the board the waiter picks the method the guest used (cash, card or transfer) and confirms; that inserts a payment row (marked pretend, amount from the item subtotals, received_by_waiter_id set to the order’s waiter, method set to the chosen one) and moves the order to paid. Both screens then show the paid amount with a clear "PRETEND PAYMENT — NO REAL MONEY MOVED" badge.</w:t>
       </w:r>
     </w:p>
     <w:tbl>
@@ -4264,6 +4290,67 @@
           <w:sz w:val="18"/>
           <w:szCs w:val="18"/>
         </w:rPr>
+        <w:t xml:space="preserve">The waiter taking payment — choosing Cash / Card / Transfer</w:t>
+      </w:r>
+    </w:p>
+    <w:tbl>
+      <w:tblPr>
+        <w:tblW w:type="dxa" w:w="13950"/>
+        <w:tblBorders>
+          <w:top w:val="single" w:color="B7B7B7" w:sz="6"/>
+          <w:left w:val="single" w:color="B7B7B7" w:sz="6"/>
+          <w:bottom w:val="single" w:color="B7B7B7" w:sz="6"/>
+          <w:right w:val="single" w:color="B7B7B7" w:sz="6"/>
+          <w:insideH w:val="none"/>
+          <w:insideV w:val="none"/>
+        </w:tblBorders>
+      </w:tblPr>
+      <w:tblGrid>
+        <w:gridCol w:w="13950"/>
+      </w:tblGrid>
+      <w:tr>
+        <w:trPr>
+          <w:trHeight w:val="4600" w:hRule="atLeast"/>
+        </w:trPr>
+        <w:tc>
+          <w:tcPr>
+            <w:tcW w:type="dxa" w:w="13950"/>
+            <w:shd w:fill="F4F6FA" w:color="auto" w:val="clear"/>
+            <w:vAlign w:val="center"/>
+          </w:tcPr>
+          <w:p>
+            <w:pPr>
+              <w:spacing w:after="0"/>
+              <w:jc w:val="center"/>
+            </w:pPr>
+            <w:r>
+              <w:rPr>
+                <w:i/>
+                <w:iCs/>
+                <w:color w:val="A6A6A6"/>
+                <w:sz w:val="20"/>
+                <w:szCs w:val="20"/>
+              </w:rPr>
+              <w:t xml:space="preserve">paste screenshot here</w:t>
+            </w:r>
+          </w:p>
+        </w:tc>
+      </w:tr>
+    </w:tbl>
+    <w:p>
+      <w:pPr>
+        <w:pStyle w:val="Caption"/>
+        <w:spacing w:after="260" w:before="60"/>
+        <w:jc w:val="center"/>
+      </w:pPr>
+      <w:r>
+        <w:rPr>
+          <w:i/>
+          <w:iCs/>
+          <w:color w:val="44546A"/>
+          <w:sz w:val="18"/>
+          <w:szCs w:val="18"/>
+        </w:rPr>
         <w:t xml:space="preserve">The paid order with the PRETEND PAYMENT badge on the customer screen</w:t>
       </w:r>
     </w:p>
@@ -4281,6 +4368,14 @@
       </w:pPr>
       <w:r>
         <w:t xml:space="preserve">5.0 How to Use the Deployed Link</w:t>
+      </w:r>
+    </w:p>
+    <w:p>
+      <w:pPr>
+        <w:spacing w:after="160" w:line="278"/>
+      </w:pPr>
+      <w:r>
+        <w:t xml:space="preserve">Use the Vercel link — it loads instantly. The Render link works identically but, on the free tier, takes about 50 seconds to wake if it has been idle.</w:t>
       </w:r>
     </w:p>
     <w:p>
@@ -4296,7 +4391,7 @@
         <w:pStyle w:val="ListParagraph"/>
         <w:numPr>
           <w:ilvl w:val="0"/>
-          <w:numId w:val="4"/>
+          <w:numId w:val="3"/>
         </w:numPr>
         <w:spacing w:after="60" w:line="278"/>
       </w:pPr>
@@ -4309,7 +4404,7 @@
         <w:pStyle w:val="ListParagraph"/>
         <w:numPr>
           <w:ilvl w:val="0"/>
-          <w:numId w:val="4"/>
+          <w:numId w:val="3"/>
         </w:numPr>
         <w:spacing w:after="60" w:line="278"/>
       </w:pPr>
@@ -4322,7 +4417,7 @@
         <w:pStyle w:val="ListParagraph"/>
         <w:numPr>
           <w:ilvl w:val="0"/>
-          <w:numId w:val="4"/>
+          <w:numId w:val="3"/>
         </w:numPr>
         <w:spacing w:after="60" w:line="278"/>
       </w:pPr>
@@ -4335,7 +4430,7 @@
         <w:pStyle w:val="ListParagraph"/>
         <w:numPr>
           <w:ilvl w:val="0"/>
-          <w:numId w:val="4"/>
+          <w:numId w:val="3"/>
         </w:numPr>
         <w:spacing w:after="60" w:line="278"/>
       </w:pPr>
@@ -4348,7 +4443,7 @@
         <w:pStyle w:val="ListParagraph"/>
         <w:numPr>
           <w:ilvl w:val="0"/>
-          <w:numId w:val="4"/>
+          <w:numId w:val="3"/>
         </w:numPr>
         <w:spacing w:after="60" w:line="278"/>
       </w:pPr>
@@ -4361,7 +4456,7 @@
         <w:pStyle w:val="ListParagraph"/>
         <w:numPr>
           <w:ilvl w:val="0"/>
-          <w:numId w:val="4"/>
+          <w:numId w:val="3"/>
         </w:numPr>
         <w:spacing w:after="60" w:line="278"/>
       </w:pPr>
@@ -4374,7 +4469,7 @@
         <w:pStyle w:val="ListParagraph"/>
         <w:numPr>
           <w:ilvl w:val="0"/>
-          <w:numId w:val="4"/>
+          <w:numId w:val="3"/>
         </w:numPr>
         <w:spacing w:after="60" w:line="278"/>
       </w:pPr>
@@ -4387,7 +4482,7 @@
         <w:pStyle w:val="ListParagraph"/>
         <w:numPr>
           <w:ilvl w:val="0"/>
-          <w:numId w:val="4"/>
+          <w:numId w:val="3"/>
         </w:numPr>
         <w:spacing w:after="60" w:line="278"/>
       </w:pPr>
@@ -4642,18 +4737,12 @@
     </w:lvlOverride>
   </w:num>
   <w:num w:numId="2">
-    <w:abstractNumId w:val="3"/>
+    <w:abstractNumId w:val="2"/>
     <w:lvlOverride w:ilvl="0">
       <w:startOverride w:val="1"/>
     </w:lvlOverride>
   </w:num>
   <w:num w:numId="3">
-    <w:abstractNumId w:val="2"/>
-    <w:lvlOverride w:ilvl="0">
-      <w:startOverride w:val="1"/>
-    </w:lvlOverride>
-  </w:num>
-  <w:num w:numId="4">
     <w:abstractNumId w:val="4"/>
     <w:lvlOverride w:ilvl="0">
       <w:startOverride w:val="1"/>

</xml_diff>

<commit_message>
chore(deploy): accept Vercel's Neon env var names; simplify the Vercel steps
Vercel's Neon integration (Storage tab) injects the connection string as
POSTGRES_URL / POSTGRES_PRISMA_URL, not DATABASE_URL. db.js and db/setup.mjs
now accept any of the three, so no renaming is needed. Docs updated: the DB
is created from the Vercel dashboard — no separate Neon account.

Co-Authored-By: Claude Sonnet 5 <noreply@anthropic.com>
</commit_message>
<xml_diff>
--- a/docs/Chowly - Application Document.docx
+++ b/docs/Chowly - Application Document.docx
@@ -2827,7 +2827,7 @@
         <w:t xml:space="preserve">Vercel </w:t>
       </w:r>
       <w:r>
-        <w:t xml:space="preserve">(vercel.json): client/ is built and served as static output; /api/* is rewritten to the api/serverless.js function; everything else falls back to index.html. DATABASE_URL (a Neon pooled connection string) and SESSION_SECRET are set in the Vercel project; NODE_ENV=production is automatic.</w:t>
+        <w:t xml:space="preserve">(vercel.json): client/ is built and served as static output; /api/* is rewritten to the api/serverless.js function; everything else falls back to index.html. The Neon database is created from the Vercel dashboard (Storage tab, no separate Neon account) and its connection string is injected automatically; db.js accepts DATABASE_URL, POSTGRES_URL or POSTGRES_PRISMA_URL. SESSION_SECRET is added by hand; NODE_ENV=production is automatic.</w:t>
       </w:r>
     </w:p>
     <w:p>
@@ -2835,7 +2835,7 @@
         <w:spacing w:after="160" w:line="278"/>
       </w:pPr>
       <w:r>
-        <w:t xml:space="preserve">To deploy to Vercel: create a free Neon project and copy its pooled connection string; import the GitHub repo at vercel.com/new; add DATABASE_URL and SESSION_SECRET; deploy. The first request loads the schema and seed, then it is instant. To reset either database by hand, run node db/setup.mjs from a laptop against that database’s connection string.</w:t>
+        <w:t xml:space="preserve">To deploy to Vercel: import the GitHub repo at vercel.com/new; in the project, Storage → Create Database → Neon; add SESSION_SECRET under Settings → Environment Variables; redeploy. The first request loads the schema and seed, then it is instant. To reset either database by hand, run node db/setup.mjs from a laptop against that database’s connection string.</w:t>
       </w:r>
     </w:p>
     <w:tbl>

</xml_diff>

<commit_message>
docs: frame the deployment chronologically — Render first, then Vercel
The application document and its .docx now say the app was deployed on Render
first and Vercel was added afterwards because of Render's ~50 s cold start,
rather than presenting Vercel as the original choice.

Co-Authored-By: Claude Sonnet 5 <noreply@anthropic.com>
</commit_message>
<xml_diff>
--- a/docs/Chowly - Application Document.docx
+++ b/docs/Chowly - Application Document.docx
@@ -273,7 +273,7 @@
           <w:b/>
           <w:bCs/>
         </w:rPr>
-        <w:t xml:space="preserve">Deployed application (Vercel — primary): </w:t>
+        <w:t xml:space="preserve">Deployed application — Vercel (use this): </w:t>
       </w:r>
       <w:r>
         <w:t xml:space="preserve">____________________</w:t>
@@ -288,7 +288,7 @@
           <w:b/>
           <w:bCs/>
         </w:rPr>
-        <w:t xml:space="preserve">Deployed application (Render — fallback): </w:t>
+        <w:t xml:space="preserve">Deployed application — Render (first deploy, ~50 s cold start): </w:t>
       </w:r>
       <w:r>
         <w:t xml:space="preserve">____________________</w:t>
@@ -423,7 +423,7 @@
         <w:t xml:space="preserve">Hosting — </w:t>
       </w:r>
       <w:r>
-        <w:t xml:space="preserve">Vercel (SPA on the CDN + the API as a serverless function, Neon Postgres) as the primary link; Render (one Node web service + Render Postgres) as a fallback. See 2.5.</w:t>
+        <w:t xml:space="preserve">first deployed on Render (one Node web service + Render Postgres); Vercel added afterwards (SPA on the CDN + the API as a serverless function, Neon Postgres) because Render’s free tier is slow to wake from idle. See 2.5.</w:t>
       </w:r>
     </w:p>
     <w:p>
@@ -2774,7 +2774,7 @@
         <w:spacing w:after="160" w:line="278"/>
       </w:pPr>
       <w:r>
-        <w:t xml:space="preserve">The application is deployed twice from the same repository. Vercel is the primary link: the SPA is served from the CDN and the API runs as one serverless function against Neon (serverless Postgres). Render is kept as a fallback and runs the same code as a long-lived Node web service against Render Postgres.</w:t>
+        <w:t xml:space="preserve">The application was first deployed on Render: one free Node web service serving the SPA and the API together, plus a free Render Postgres instance, wired up by render.yaml. That works, but Render’s free web service sleeps after about 15 minutes idle and takes roughly 50 seconds to wake on the next request, so a facilitator opening a cold link would sit on a blank page for the best part of a minute.</w:t>
       </w:r>
     </w:p>
     <w:p>
@@ -2782,14 +2782,7 @@
         <w:spacing w:after="160" w:line="278"/>
       </w:pPr>
       <w:r>
-        <w:rPr>
-          <w:b/>
-          <w:bCs/>
-        </w:rPr>
-        <w:t xml:space="preserve">Why two. </w:t>
-      </w:r>
-      <w:r>
-        <w:t xml:space="preserve">Render’s free web service sleeps after about 15 minutes idle and takes roughly 50 seconds to wake on the next request, so a facilitator opening a cold link would sit on a blank page for the best part of a minute. Vercel was added as the primary link because its static SPA loads from the CDN instantly and the API function cold-starts in a fraction of a second against Neon’s always-on database. Keeping Render as well shows the same code runs unchanged as a plain server.</w:t>
+        <w:t xml:space="preserve">To fix that, a second deployment was added on Vercel, from the same repository. On Vercel the static SPA is served straight from the CDN (instant) and the API runs as one serverless function that cold-starts in a fraction of a second against Neon (serverless Postgres). Vercel is therefore the link to use; Render is kept as a fallback and to show the same code runs unchanged as a long-lived server.</w:t>
       </w:r>
     </w:p>
     <w:p>
@@ -2797,7 +2790,7 @@
         <w:spacing w:after="160" w:line="278"/>
       </w:pPr>
       <w:r>
-        <w:t xml:space="preserve">The Express app is factored into server/src/app.js (the app) with two thin entry points: server/src/index.js calls app.listen() for Render and local use, and api/serverless.js exports the same app as a Vercel function. server/src/bootstrap.js loads schema.sql, seed.sql and menu_images.sql the first time the app runs against an empty database (checked via the menu_item table; a no-op once it exists), so neither platform needs a shell for the initial data load. db.js turns on SSL when NODE_ENV is production, and the session cookie is secure behind both platforms’ HTTPS.</w:t>
+        <w:t xml:space="preserve">Adding Vercel meant factoring the Express app into server/src/app.js (the app) plus two thin entry points: server/src/index.js still calls app.listen() for Render and local use, and api/serverless.js exports the same app as a Vercel function. server/src/bootstrap.js loads schema.sql, seed.sql and menu_images.sql the first time the app runs against an empty database (checked via the menu_item table; a no-op once it exists), so neither platform needs a shell for the initial data load. db.js turns on SSL when NODE_ENV is production, and the session cookie is secure behind both platforms’ HTTPS.</w:t>
       </w:r>
     </w:p>
     <w:p>
@@ -2896,7 +2889,7 @@
           <w:sz w:val="18"/>
           <w:szCs w:val="18"/>
         </w:rPr>
-        <w:t xml:space="preserve">The Vercel project — build settings and DATABASE_URL / SESSION_SECRET</w:t>
+        <w:t xml:space="preserve">The Render Blueprint creating chowly-db and the chowly web service (first deployment)</w:t>
       </w:r>
     </w:p>
     <w:tbl>
@@ -2957,7 +2950,7 @@
           <w:sz w:val="18"/>
           <w:szCs w:val="18"/>
         </w:rPr>
-        <w:t xml:space="preserve">The application open at its Vercel URL (loads instantly)</w:t>
+        <w:t xml:space="preserve">The application open at its Render URL — note the ~50 s cold start</w:t>
       </w:r>
     </w:p>
     <w:tbl>
@@ -3018,7 +3011,7 @@
           <w:sz w:val="18"/>
           <w:szCs w:val="18"/>
         </w:rPr>
-        <w:t xml:space="preserve">The Render Blueprint creating chowly-db and the chowly web service</w:t>
+        <w:t xml:space="preserve">The Vercel project — Storage (Neon) and the SESSION_SECRET variable</w:t>
       </w:r>
     </w:p>
     <w:tbl>
@@ -3079,7 +3072,7 @@
           <w:sz w:val="18"/>
           <w:szCs w:val="18"/>
         </w:rPr>
-        <w:t xml:space="preserve">The application open at its Render URL</w:t>
+        <w:t xml:space="preserve">The application open at its Vercel URL (loads instantly)</w:t>
       </w:r>
     </w:p>
     <w:p>

</xml_diff>

<commit_message>
feat: one open order per table until the previous one is paid
- POST /api/orders rejects (409) a new order when that table already has an
  order whose status is not paid/cancelled, and returns the open order's id.
- The cart shows the message plus a "View the current order for this table"
  link that jumps to its tracking screen.
- api.js now attaches the response body + status to thrown errors so callers
  can read fields like openOrderId.

Co-Authored-By: Claude Sonnet 5 <noreply@anthropic.com>
</commit_message>
<xml_diff>
--- a/docs/Chowly - Application Document.docx
+++ b/docs/Chowly - Application Document.docx
@@ -3657,6 +3657,14 @@
         <w:t xml:space="preserve">sets the estimated wait to the larger of the kitchen queue and the bar queue, since the two prepare in parallel.</w:t>
       </w:r>
     </w:p>
+    <w:p>
+      <w:pPr>
+        <w:spacing w:after="160" w:line="278"/>
+      </w:pPr>
+      <w:r>
+        <w:t xml:space="preserve">One open order per table: if the chosen table already has an order that is not paid (or cancelled), the order is refused and the cart offers a link straight to that current order. A fresh order can only be placed at the table once the previous one is paid.</w:t>
+      </w:r>
+    </w:p>
     <w:tbl>
       <w:tblPr>
         <w:tblW w:type="dxa" w:w="13950"/>
@@ -3716,6 +3724,67 @@
           <w:szCs w:val="18"/>
         </w:rPr>
         <w:t xml:space="preserve">The cart, with the table dropdown, at checkout</w:t>
+      </w:r>
+    </w:p>
+    <w:tbl>
+      <w:tblPr>
+        <w:tblW w:type="dxa" w:w="13950"/>
+        <w:tblBorders>
+          <w:top w:val="single" w:color="B7B7B7" w:sz="6"/>
+          <w:left w:val="single" w:color="B7B7B7" w:sz="6"/>
+          <w:bottom w:val="single" w:color="B7B7B7" w:sz="6"/>
+          <w:right w:val="single" w:color="B7B7B7" w:sz="6"/>
+          <w:insideH w:val="none"/>
+          <w:insideV w:val="none"/>
+        </w:tblBorders>
+      </w:tblPr>
+      <w:tblGrid>
+        <w:gridCol w:w="13950"/>
+      </w:tblGrid>
+      <w:tr>
+        <w:trPr>
+          <w:trHeight w:val="4600" w:hRule="atLeast"/>
+        </w:trPr>
+        <w:tc>
+          <w:tcPr>
+            <w:tcW w:type="dxa" w:w="13950"/>
+            <w:shd w:fill="F4F6FA" w:color="auto" w:val="clear"/>
+            <w:vAlign w:val="center"/>
+          </w:tcPr>
+          <w:p>
+            <w:pPr>
+              <w:spacing w:after="0"/>
+              <w:jc w:val="center"/>
+            </w:pPr>
+            <w:r>
+              <w:rPr>
+                <w:i/>
+                <w:iCs/>
+                <w:color w:val="A6A6A6"/>
+                <w:sz w:val="20"/>
+                <w:szCs w:val="20"/>
+              </w:rPr>
+              <w:t xml:space="preserve">paste screenshot here</w:t>
+            </w:r>
+          </w:p>
+        </w:tc>
+      </w:tr>
+    </w:tbl>
+    <w:p>
+      <w:pPr>
+        <w:pStyle w:val="Caption"/>
+        <w:spacing w:after="260" w:before="60"/>
+        <w:jc w:val="center"/>
+      </w:pPr>
+      <w:r>
+        <w:rPr>
+          <w:i/>
+          <w:iCs/>
+          <w:color w:val="44546A"/>
+          <w:sz w:val="18"/>
+          <w:szCs w:val="18"/>
+        </w:rPr>
+        <w:t xml:space="preserve">Trying to order at a table that already has an order in progress</w:t>
       </w:r>
     </w:p>
     <w:p>

</xml_diff>